<commit_message>
Anexa acoes-respostas da Amalia (Castelo de Gelo e Giz + Sorrow Peak) ao Missao.pdf.docx
Co-authored-by: arena-agent <297053741+arena-agent@users.noreply.github.com>
</commit_message>
<xml_diff>
--- a/Missão.pdf.docx
+++ b/Missão.pdf.docx
@@ -18175,6 +18175,650 @@
           <w:rtl w:val="0"/>
         </w:rPr>
         <w:t xml:space="preserve">https://64.media.tumblr.com/8b040fd9473847f2b235197b78f2546e/bd81c4eeeba48980-43/s540x810/210932b6f02a835600081117f35a9445fd3bfa8f.gif</w:t>
+      </w:r>
+    </w:p>
+    <w:p>
+      <w:pPr>
+        <w:keepNext w:val="0"/>
+        <w:keepLines w:val="0"/>
+        <w:pageBreakBefore w:val="0"/>
+        <w:widowControl w:val="0"/>
+        <w:pBdr>
+          <w:top w:space="0" w:sz="0" w:val="nil"/>
+          <w:left w:space="0" w:sz="0" w:val="nil"/>
+          <w:bottom w:space="0" w:sz="0" w:val="nil"/>
+          <w:right w:space="0" w:sz="0" w:val="nil"/>
+          <w:between w:space="0" w:sz="0" w:val="nil"/>
+        </w:pBdr>
+        <w:shd w:fill="auto" w:val="clear"/>
+        <w:spacing w:after="0" w:before="302.75421142578125" w:line="240" w:lineRule="auto"/>
+        <w:ind w:left="0" w:right="-1405.5118110236212" w:firstLine="0"/>
+        <w:jc w:val="right"/>
+        <w:rPr/>
+      </w:pPr>
+      <w:r>
+        <w:rPr>
+          <w:rtl w:val="0"/>
+        </w:rPr>
+        <w:t xml:space="preserve">─── ❖ ── ✦ ── 𝔄𝔪𝔞́𝔩𝔦𝔞 𝔅𝔩𝔞𝔠𝔨𝔟𝔢𝔞𝔨 ── ✦ ── ❖ ───</w:t>
+      </w:r>
+    </w:p>
+    <w:p>
+      <w:pPr>
+        <w:keepNext w:val="0"/>
+        <w:keepLines w:val="0"/>
+        <w:pageBreakBefore w:val="0"/>
+        <w:widowControl w:val="0"/>
+        <w:pBdr>
+          <w:top w:space="0" w:sz="0" w:val="nil"/>
+          <w:left w:space="0" w:sz="0" w:val="nil"/>
+          <w:bottom w:space="0" w:sz="0" w:val="nil"/>
+          <w:right w:space="0" w:sz="0" w:val="nil"/>
+          <w:between w:space="0" w:sz="0" w:val="nil"/>
+        </w:pBdr>
+        <w:shd w:fill="auto" w:val="clear"/>
+        <w:spacing w:after="0" w:before="302.75421142578125" w:line="240" w:lineRule="auto"/>
+        <w:ind w:left="0" w:right="-1405.5118110236212" w:firstLine="0"/>
+        <w:jc w:val="right"/>
+        <w:rPr/>
+      </w:pPr>
+      <w:r>
+        <w:rPr>
+          <w:rFonts w:ascii="Arial Unicode MS" w:cs="Arial Unicode MS" w:eastAsia="Arial Unicode MS" w:hAnsi="Arial Unicode MS"/>
+          <w:rtl w:val="0"/>
+        </w:rPr>
+        <w:t xml:space="preserve">ㅤㅤㅤ</w:t>
+      </w:r>
+    </w:p>
+    <w:p>
+      <w:pPr>
+        <w:keepNext w:val="0"/>
+        <w:keepLines w:val="0"/>
+        <w:pageBreakBefore w:val="0"/>
+        <w:widowControl w:val="0"/>
+        <w:pBdr>
+          <w:top w:space="0" w:sz="0" w:val="nil"/>
+          <w:left w:space="0" w:sz="0" w:val="nil"/>
+          <w:bottom w:space="0" w:sz="0" w:val="nil"/>
+          <w:right w:space="0" w:sz="0" w:val="nil"/>
+          <w:between w:space="0" w:sz="0" w:val="nil"/>
+        </w:pBdr>
+        <w:shd w:fill="auto" w:val="clear"/>
+        <w:spacing w:after="0" w:before="302.75421142578125" w:line="240" w:lineRule="auto"/>
+        <w:ind w:left="0" w:right="-1405.5118110236212" w:firstLine="0"/>
+        <w:jc w:val="right"/>
+        <w:rPr/>
+      </w:pPr>
+      <w:r>
+        <w:rPr>
+          <w:rFonts w:ascii="Arial Unicode MS" w:cs="Arial Unicode MS" w:eastAsia="Arial Unicode MS" w:hAnsi="Arial Unicode MS"/>
+          <w:rtl w:val="0"/>
+        </w:rPr>
+        <w:t xml:space="preserve">ㅤㅤㅤ𝔒 portão fechou atrás dela com um estalo seco, e o silêncio que veio depois foi pior que o rugido. Amália ficou parada um instante, só ouvindo. O castelo não rangia. Não se acomodava com o vento como pedra velha costuma fazer. Por baixo do gelo havia giz, e no giz havia riscos retos demais para serem rachaduras — linhas que alguém tinha desenhado com paciência, sem pressa nenhuma de terminar. Ela encostou os dedos na mais próxima e sentiu a coisa responder, uma firmeza quieta, como se a parede soubesse exatamente o que era. Isso bastou. Era Cabalístico: forja, sangue, osso, o ramo que dá forma às coisas e não aceita que nada escape dele. O mesmo ramo do Rei de Giz. O mesmo ramo das Feras de Ferro que ainda rugiam do lado de fora. E ela, que carregava morte e sombra e som no sangue, estava do lado errado da equação. Puxou um fio de tecelagem só para testar, e o fio voltou duro, sem ceder, como corda molhada demais para ser amarrada. A revoada morreu-lhe na garganta. Amália soltou o ar pelo nariz, quase achando graça. Claro. Sombra não corta forja.</w:t>
+      </w:r>
+    </w:p>
+    <w:p>
+      <w:pPr>
+        <w:keepNext w:val="0"/>
+        <w:keepLines w:val="0"/>
+        <w:pageBreakBefore w:val="0"/>
+        <w:widowControl w:val="0"/>
+        <w:pBdr>
+          <w:top w:space="0" w:sz="0" w:val="nil"/>
+          <w:left w:space="0" w:sz="0" w:val="nil"/>
+          <w:bottom w:space="0" w:sz="0" w:val="nil"/>
+          <w:right w:space="0" w:sz="0" w:val="nil"/>
+          <w:between w:space="0" w:sz="0" w:val="nil"/>
+        </w:pBdr>
+        <w:shd w:fill="auto" w:val="clear"/>
+        <w:spacing w:after="0" w:before="302.75421142578125" w:line="240" w:lineRule="auto"/>
+        <w:ind w:left="0" w:right="-1405.5118110236212" w:firstLine="0"/>
+        <w:jc w:val="right"/>
+        <w:rPr/>
+      </w:pPr>
+      <w:r>
+        <w:rPr>
+          <w:rFonts w:ascii="Arial Unicode MS" w:cs="Arial Unicode MS" w:eastAsia="Arial Unicode MS" w:hAnsi="Arial Unicode MS"/>
+          <w:rtl w:val="0"/>
+        </w:rPr>
+        <w:t xml:space="preserve">ㅤㅤㅤ</w:t>
+      </w:r>
+    </w:p>
+    <w:p>
+      <w:pPr>
+        <w:keepNext w:val="0"/>
+        <w:keepLines w:val="0"/>
+        <w:pageBreakBefore w:val="0"/>
+        <w:widowControl w:val="0"/>
+        <w:pBdr>
+          <w:top w:space="0" w:sz="0" w:val="nil"/>
+          <w:left w:space="0" w:sz="0" w:val="nil"/>
+          <w:bottom w:space="0" w:sz="0" w:val="nil"/>
+          <w:right w:space="0" w:sz="0" w:val="nil"/>
+          <w:between w:space="0" w:sz="0" w:val="nil"/>
+        </w:pBdr>
+        <w:shd w:fill="auto" w:val="clear"/>
+        <w:spacing w:after="0" w:before="302.75421142578125" w:line="240" w:lineRule="auto"/>
+        <w:ind w:left="0" w:right="-1405.5118110236212" w:firstLine="0"/>
+        <w:jc w:val="right"/>
+        <w:rPr/>
+      </w:pPr>
+      <w:r>
+        <w:rPr>
+          <w:rFonts w:ascii="Arial Unicode MS" w:cs="Arial Unicode MS" w:eastAsia="Arial Unicode MS" w:hAnsi="Arial Unicode MS"/>
+          <w:rtl w:val="0"/>
+        </w:rPr>
+        <w:t xml:space="preserve">ㅤㅤㅤ𝔈ntão parou de lutar do jeito de sempre e decidiu lutar do jeito que aquele lugar entendia. Passou a mão no gelo da parede, marcou mentalmente o vão do corredor, a grade, o arco rachado em cima da entrada — e chamou. Os quatro corvos desceram do escuro do teto sem barulho, três metros cada, penas engolindo a luz das tochas, bicos e garras reluzindo em ouro. Não os mandou atrás de ninguém. Mandou-os trabalhar. Um encostou o bico na grade e o ferro virou ouro ali mesmo, pesado, morto, sem alma nenhuma para negociar. Outro fechou o vão do arco com uma parede dourada que ia continuar de pé muito depois de as aves sumirem. Ela recuou dois passos e olhou o serviço, e por um momento teve a impressão idiota de que o ouro tinha vindo rápido demais às mãos dela, como se já soubesse o caminho. Depois lembrou do preço, porque preço ela nunca esquece. Quando os corvos fossem embora, o metal ia cobrar a estadia: dois turnos de juntas travadas, mãos inúteis, o corpo parado. Por isso a pressa em fechar a porta primeiro. Restou-lhe ainda um pensamento de rabisco, daqueles que ela arquivava para depois — contra forma, sonho; o que sobrepõe o Cabalístico é o Gnóstico. Ouro fecha porta. Portal abre.</w:t>
+      </w:r>
+    </w:p>
+    <w:p>
+      <w:pPr>
+        <w:keepNext w:val="0"/>
+        <w:keepLines w:val="0"/>
+        <w:pageBreakBefore w:val="0"/>
+        <w:widowControl w:val="0"/>
+        <w:pBdr>
+          <w:top w:space="0" w:sz="0" w:val="nil"/>
+          <w:left w:space="0" w:sz="0" w:val="nil"/>
+          <w:bottom w:space="0" w:sz="0" w:val="nil"/>
+          <w:right w:space="0" w:sz="0" w:val="nil"/>
+          <w:between w:space="0" w:sz="0" w:val="nil"/>
+        </w:pBdr>
+        <w:shd w:fill="auto" w:val="clear"/>
+        <w:spacing w:after="0" w:before="302.75421142578125" w:line="240" w:lineRule="auto"/>
+        <w:ind w:left="0" w:right="-1405.5118110236212" w:firstLine="0"/>
+        <w:jc w:val="right"/>
+        <w:rPr/>
+      </w:pPr>
+      <w:r>
+        <w:rPr>
+          <w:rFonts w:ascii="Arial Unicode MS" w:cs="Arial Unicode MS" w:eastAsia="Arial Unicode MS" w:hAnsi="Arial Unicode MS"/>
+          <w:rtl w:val="0"/>
+        </w:rPr>
+        <w:t xml:space="preserve">ㅤㅤㅤ</w:t>
+      </w:r>
+    </w:p>
+    <w:p>
+      <w:pPr>
+        <w:keepNext w:val="0"/>
+        <w:keepLines w:val="0"/>
+        <w:pageBreakBefore w:val="0"/>
+        <w:widowControl w:val="0"/>
+        <w:pBdr>
+          <w:top w:space="0" w:sz="0" w:val="nil"/>
+          <w:left w:space="0" w:sz="0" w:val="nil"/>
+          <w:bottom w:space="0" w:sz="0" w:val="nil"/>
+          <w:right w:space="0" w:sz="0" w:val="nil"/>
+          <w:between w:space="0" w:sz="0" w:val="nil"/>
+        </w:pBdr>
+        <w:shd w:fill="auto" w:val="clear"/>
+        <w:spacing w:after="0" w:before="302.75421142578125" w:line="240" w:lineRule="auto"/>
+        <w:ind w:left="0" w:right="-1405.5118110236212" w:firstLine="0"/>
+        <w:jc w:val="right"/>
+        <w:rPr/>
+      </w:pPr>
+      <w:r>
+        <w:rPr>
+          <w:rFonts w:ascii="Arial Unicode MS" w:cs="Arial Unicode MS" w:eastAsia="Arial Unicode MS" w:hAnsi="Arial Unicode MS"/>
+          <w:rtl w:val="0"/>
+        </w:rPr>
+        <w:t xml:space="preserve">ㅤㅤㅤ— Nada de sombra aqui dentro — disse baixo, mais para si do que para os outros. — Aqui eles sabem ler sombra. Ouro é outra conversa.</w:t>
+      </w:r>
+    </w:p>
+    <w:p>
+      <w:pPr>
+        <w:keepNext w:val="0"/>
+        <w:keepLines w:val="0"/>
+        <w:pageBreakBefore w:val="0"/>
+        <w:widowControl w:val="0"/>
+        <w:pBdr>
+          <w:top w:space="0" w:sz="0" w:val="nil"/>
+          <w:left w:space="0" w:sz="0" w:val="nil"/>
+          <w:bottom w:space="0" w:sz="0" w:val="nil"/>
+          <w:right w:space="0" w:sz="0" w:val="nil"/>
+          <w:between w:space="0" w:sz="0" w:val="nil"/>
+        </w:pBdr>
+        <w:shd w:fill="auto" w:val="clear"/>
+        <w:spacing w:after="0" w:before="302.75421142578125" w:line="240" w:lineRule="auto"/>
+        <w:ind w:left="0" w:right="-1405.5118110236212" w:firstLine="0"/>
+        <w:jc w:val="right"/>
+        <w:rPr/>
+      </w:pPr>
+      <w:r>
+        <w:rPr>
+          <w:rFonts w:ascii="Arial Unicode MS" w:cs="Arial Unicode MS" w:eastAsia="Arial Unicode MS" w:hAnsi="Arial Unicode MS"/>
+          <w:rtl w:val="0"/>
+        </w:rPr>
+        <w:t xml:space="preserve">ㅤㅤㅤ</w:t>
+      </w:r>
+    </w:p>
+    <w:p>
+      <w:pPr>
+        <w:keepNext w:val="0"/>
+        <w:keepLines w:val="0"/>
+        <w:pageBreakBefore w:val="0"/>
+        <w:widowControl w:val="0"/>
+        <w:pBdr>
+          <w:top w:space="0" w:sz="0" w:val="nil"/>
+          <w:left w:space="0" w:sz="0" w:val="nil"/>
+          <w:bottom w:space="0" w:sz="0" w:val="nil"/>
+          <w:right w:space="0" w:sz="0" w:val="nil"/>
+          <w:between w:space="0" w:sz="0" w:val="nil"/>
+        </w:pBdr>
+        <w:shd w:fill="auto" w:val="clear"/>
+        <w:spacing w:after="0" w:before="302.75421142578125" w:line="240" w:lineRule="auto"/>
+        <w:ind w:left="0" w:right="-1405.5118110236212" w:firstLine="0"/>
+        <w:jc w:val="right"/>
+        <w:rPr/>
+      </w:pPr>
+      <w:r>
+        <w:rPr>
+          <w:rtl w:val="0"/>
+        </w:rPr>
+        <w:t xml:space="preserve">─── ❖ ── ✦ ──</w:t>
+      </w:r>
+    </w:p>
+    <w:p>
+      <w:pPr>
+        <w:keepNext w:val="0"/>
+        <w:keepLines w:val="0"/>
+        <w:pageBreakBefore w:val="0"/>
+        <w:widowControl w:val="0"/>
+        <w:pBdr>
+          <w:top w:space="0" w:sz="0" w:val="nil"/>
+          <w:left w:space="0" w:sz="0" w:val="nil"/>
+          <w:bottom w:space="0" w:sz="0" w:val="nil"/>
+          <w:right w:space="0" w:sz="0" w:val="nil"/>
+          <w:between w:space="0" w:sz="0" w:val="nil"/>
+        </w:pBdr>
+        <w:shd w:fill="auto" w:val="clear"/>
+        <w:spacing w:after="0" w:before="302.75421142578125" w:line="240" w:lineRule="auto"/>
+        <w:ind w:left="0" w:right="-1405.5118110236212" w:firstLine="0"/>
+        <w:jc w:val="right"/>
+        <w:rPr/>
+      </w:pPr>
+      <w:r>
+        <w:rPr>
+          <w:rFonts w:ascii="Arial Unicode MS" w:cs="Arial Unicode MS" w:eastAsia="Arial Unicode MS" w:hAnsi="Arial Unicode MS"/>
+          <w:rtl w:val="0"/>
+        </w:rPr>
+        <w:t xml:space="preserve">ㅤㅤㅤ</w:t>
+      </w:r>
+    </w:p>
+    <w:p>
+      <w:pPr>
+        <w:keepNext w:val="0"/>
+        <w:keepLines w:val="0"/>
+        <w:pageBreakBefore w:val="0"/>
+        <w:widowControl w:val="0"/>
+        <w:pBdr>
+          <w:top w:space="0" w:sz="0" w:val="nil"/>
+          <w:left w:space="0" w:sz="0" w:val="nil"/>
+          <w:bottom w:space="0" w:sz="0" w:val="nil"/>
+          <w:right w:space="0" w:sz="0" w:val="nil"/>
+          <w:between w:space="0" w:sz="0" w:val="nil"/>
+        </w:pBdr>
+        <w:shd w:fill="auto" w:val="clear"/>
+        <w:spacing w:after="0" w:before="302.75421142578125" w:line="240" w:lineRule="auto"/>
+        <w:ind w:left="0" w:right="-1405.5118110236212" w:firstLine="0"/>
+        <w:jc w:val="right"/>
+        <w:rPr/>
+      </w:pPr>
+      <w:r>
+        <w:rPr>
+          <w:rFonts w:ascii="Arial Unicode MS" w:cs="Arial Unicode MS" w:eastAsia="Arial Unicode MS" w:hAnsi="Arial Unicode MS"/>
+          <w:rtl w:val="0"/>
+        </w:rPr>
+        <w:t xml:space="preserve">Resumo: Amália entra no Castelo de Gelo e Giz, reconhece pelo giz sob o gelo que pisou em território Cabalístico — o ramo que neutraliza o Selvagem, o dela — e entende que sombra e tecelagem ali não valem nada. Como as Feras de Ferro são a forja de Lilith, do mesmo ramo, ela aposta no único registro que aquela casa respeita: matéria. Invoca os karate crows of Midas, manda-os trabalhar como operários, transmuta a grade e o arco da entrada em ouro permanente e guarda um bico limpo para o primeiro alvo consciente, aceitando o tributo de dois turnos de juntas travadas atrás da barreira que ela mesma ergueu. E arquiva o contra-ramo: contra o Cabalístico, sobrepõe o Gnóstico.</w:t>
+      </w:r>
+    </w:p>
+    <w:p>
+      <w:pPr>
+        <w:keepNext w:val="0"/>
+        <w:keepLines w:val="0"/>
+        <w:pageBreakBefore w:val="0"/>
+        <w:widowControl w:val="0"/>
+        <w:pBdr>
+          <w:top w:space="0" w:sz="0" w:val="nil"/>
+          <w:left w:space="0" w:sz="0" w:val="nil"/>
+          <w:bottom w:space="0" w:sz="0" w:val="nil"/>
+          <w:right w:space="0" w:sz="0" w:val="nil"/>
+          <w:between w:space="0" w:sz="0" w:val="nil"/>
+        </w:pBdr>
+        <w:shd w:fill="auto" w:val="clear"/>
+        <w:spacing w:after="0" w:before="302.75421142578125" w:line="240" w:lineRule="auto"/>
+        <w:ind w:left="0" w:right="-1405.5118110236212" w:firstLine="0"/>
+        <w:jc w:val="right"/>
+        <w:rPr/>
+      </w:pPr>
+      <w:r>
+        <w:rPr>
+          <w:rtl w:val="0"/>
+        </w:rPr>
+        <w:t xml:space="preserve">─── ❖ ── ✦ ── 𝔄𝔪𝔞́𝔩𝔦𝔞 𝔅𝔩𝔞𝔠𝔨𝔟𝔢𝔞𝔨 ── ✦ ── ❖ ───</w:t>
+      </w:r>
+    </w:p>
+    <w:p>
+      <w:pPr>
+        <w:keepNext w:val="0"/>
+        <w:keepLines w:val="0"/>
+        <w:pageBreakBefore w:val="0"/>
+        <w:widowControl w:val="0"/>
+        <w:pBdr>
+          <w:top w:space="0" w:sz="0" w:val="nil"/>
+          <w:left w:space="0" w:sz="0" w:val="nil"/>
+          <w:bottom w:space="0" w:sz="0" w:val="nil"/>
+          <w:right w:space="0" w:sz="0" w:val="nil"/>
+          <w:between w:space="0" w:sz="0" w:val="nil"/>
+        </w:pBdr>
+        <w:shd w:fill="auto" w:val="clear"/>
+        <w:spacing w:after="0" w:before="302.75421142578125" w:line="240" w:lineRule="auto"/>
+        <w:ind w:left="0" w:right="-1405.5118110236212" w:firstLine="0"/>
+        <w:jc w:val="right"/>
+        <w:rPr/>
+      </w:pPr>
+      <w:r>
+        <w:rPr>
+          <w:rFonts w:ascii="Arial Unicode MS" w:cs="Arial Unicode MS" w:eastAsia="Arial Unicode MS" w:hAnsi="Arial Unicode MS"/>
+          <w:rtl w:val="0"/>
+        </w:rPr>
+        <w:t xml:space="preserve">ㅤㅤㅤ</w:t>
+      </w:r>
+    </w:p>
+    <w:p>
+      <w:pPr>
+        <w:keepNext w:val="0"/>
+        <w:keepLines w:val="0"/>
+        <w:pageBreakBefore w:val="0"/>
+        <w:widowControl w:val="0"/>
+        <w:pBdr>
+          <w:top w:space="0" w:sz="0" w:val="nil"/>
+          <w:left w:space="0" w:sz="0" w:val="nil"/>
+          <w:bottom w:space="0" w:sz="0" w:val="nil"/>
+          <w:right w:space="0" w:sz="0" w:val="nil"/>
+          <w:between w:space="0" w:sz="0" w:val="nil"/>
+        </w:pBdr>
+        <w:shd w:fill="auto" w:val="clear"/>
+        <w:spacing w:after="0" w:before="302.75421142578125" w:line="240" w:lineRule="auto"/>
+        <w:ind w:left="0" w:right="-1405.5118110236212" w:firstLine="0"/>
+        <w:jc w:val="right"/>
+        <w:rPr/>
+      </w:pPr>
+      <w:r>
+        <w:rPr>
+          <w:rFonts w:ascii="Arial Unicode MS" w:cs="Arial Unicode MS" w:eastAsia="Arial Unicode MS" w:hAnsi="Arial Unicode MS"/>
+          <w:rtl w:val="0"/>
+        </w:rPr>
+        <w:t xml:space="preserve">ㅤㅤㅤ𝔒 mundo não tinha cor, e foi isso que a fez parar antes de qualquer outra coisa. A queda terminou sem dor nenhuma — e era aí que estava o erro. Amália ficou de joelhos no chão de pedra, procurou o rasgo no ombro direito e não achou nem a ferida nem o sangue: não havia frio, não havia cansaço, não havia nada. Um lugar que apaga ferida não está curando ninguém; está avisando que o corpo dela ali não conta. Ela chamou as sombras e as sombras não vieram. Chamou os fios e o peito devolveu silêncio. As palmas, onde o estigma espectral sempre pulsava, estavam limpas e mudas como duas portas trancadas. Amália respirou fundo, aceitou o recado e leu o resto com os olhos: a cidade em preto e branco à frente era Dusk Falls copiada com paciência, rua por rua, telhado por telhado. Ninguém constrói uma cópia dessas para morar. Constrói para guardar.</w:t>
+      </w:r>
+    </w:p>
+    <w:p>
+      <w:pPr>
+        <w:keepNext w:val="0"/>
+        <w:keepLines w:val="0"/>
+        <w:pageBreakBefore w:val="0"/>
+        <w:widowControl w:val="0"/>
+        <w:pBdr>
+          <w:top w:space="0" w:sz="0" w:val="nil"/>
+          <w:left w:space="0" w:sz="0" w:val="nil"/>
+          <w:bottom w:space="0" w:sz="0" w:val="nil"/>
+          <w:right w:space="0" w:sz="0" w:val="nil"/>
+          <w:between w:space="0" w:sz="0" w:val="nil"/>
+        </w:pBdr>
+        <w:shd w:fill="auto" w:val="clear"/>
+        <w:spacing w:after="0" w:before="302.75421142578125" w:line="240" w:lineRule="auto"/>
+        <w:ind w:left="0" w:right="-1405.5118110236212" w:firstLine="0"/>
+        <w:jc w:val="right"/>
+        <w:rPr/>
+      </w:pPr>
+      <w:r>
+        <w:rPr>
+          <w:rFonts w:ascii="Arial Unicode MS" w:cs="Arial Unicode MS" w:eastAsia="Arial Unicode MS" w:hAnsi="Arial Unicode MS"/>
+          <w:rtl w:val="0"/>
+        </w:rPr>
+        <w:t xml:space="preserve">ㅤㅤㅤ</w:t>
+      </w:r>
+    </w:p>
+    <w:p>
+      <w:pPr>
+        <w:keepNext w:val="0"/>
+        <w:keepLines w:val="0"/>
+        <w:pageBreakBefore w:val="0"/>
+        <w:widowControl w:val="0"/>
+        <w:pBdr>
+          <w:top w:space="0" w:sz="0" w:val="nil"/>
+          <w:left w:space="0" w:sz="0" w:val="nil"/>
+          <w:bottom w:space="0" w:sz="0" w:val="nil"/>
+          <w:right w:space="0" w:sz="0" w:val="nil"/>
+          <w:between w:space="0" w:sz="0" w:val="nil"/>
+        </w:pBdr>
+        <w:shd w:fill="auto" w:val="clear"/>
+        <w:spacing w:after="0" w:before="302.75421142578125" w:line="240" w:lineRule="auto"/>
+        <w:ind w:left="0" w:right="-1405.5118110236212" w:firstLine="0"/>
+        <w:jc w:val="right"/>
+        <w:rPr/>
+      </w:pPr>
+      <w:r>
+        <w:rPr>
+          <w:rFonts w:ascii="Arial Unicode MS" w:cs="Arial Unicode MS" w:eastAsia="Arial Unicode MS" w:hAnsi="Arial Unicode MS"/>
+          <w:rtl w:val="0"/>
+        </w:rPr>
+        <w:t xml:space="preserve">ㅤㅤㅤ𝔈la seguiu o único caminho que aquele mundo parecia indicar, um corredor que descia para a sala do trono. O Pérola Negra estava lá, sentado na cadeira de pérola negra como quem nunca tinha feito outra coisa na vida. Falou primeiro, com o acento arrastado e o sorriso de quem já tinha ganhado a conversa: era a segunda vez que alguém como ela aparecia na frente dele, e a primeira tinha nome e nunca voltou para contar o resto. — E você? Como se chama? — Amália entendeu a pergunta pelo que ela era. Nome é alça: é por onde se pega uma pessoa, é o que se amarra num contrato, é o que continua preso depois que o corpo já foi.</w:t>
+      </w:r>
+    </w:p>
+    <w:p>
+      <w:pPr>
+        <w:keepNext w:val="0"/>
+        <w:keepLines w:val="0"/>
+        <w:pageBreakBefore w:val="0"/>
+        <w:widowControl w:val="0"/>
+        <w:pBdr>
+          <w:top w:space="0" w:sz="0" w:val="nil"/>
+          <w:left w:space="0" w:sz="0" w:val="nil"/>
+          <w:bottom w:space="0" w:sz="0" w:val="nil"/>
+          <w:right w:space="0" w:sz="0" w:val="nil"/>
+          <w:between w:space="0" w:sz="0" w:val="nil"/>
+        </w:pBdr>
+        <w:shd w:fill="auto" w:val="clear"/>
+        <w:spacing w:after="0" w:before="302.75421142578125" w:line="240" w:lineRule="auto"/>
+        <w:ind w:left="0" w:right="-1405.5118110236212" w:firstLine="0"/>
+        <w:jc w:val="right"/>
+        <w:rPr/>
+      </w:pPr>
+      <w:r>
+        <w:rPr>
+          <w:rFonts w:ascii="Arial Unicode MS" w:cs="Arial Unicode MS" w:eastAsia="Arial Unicode MS" w:hAnsi="Arial Unicode MS"/>
+          <w:rtl w:val="0"/>
+        </w:rPr>
+        <w:t xml:space="preserve">ㅤㅤㅤ</w:t>
+      </w:r>
+    </w:p>
+    <w:p>
+      <w:pPr>
+        <w:keepNext w:val="0"/>
+        <w:keepLines w:val="0"/>
+        <w:pageBreakBefore w:val="0"/>
+        <w:widowControl w:val="0"/>
+        <w:pBdr>
+          <w:top w:space="0" w:sz="0" w:val="nil"/>
+          <w:left w:space="0" w:sz="0" w:val="nil"/>
+          <w:bottom w:space="0" w:sz="0" w:val="nil"/>
+          <w:right w:space="0" w:sz="0" w:val="nil"/>
+          <w:between w:space="0" w:sz="0" w:val="nil"/>
+        </w:pBdr>
+        <w:shd w:fill="auto" w:val="clear"/>
+        <w:spacing w:after="0" w:before="302.75421142578125" w:line="240" w:lineRule="auto"/>
+        <w:ind w:left="0" w:right="-1405.5118110236212" w:firstLine="0"/>
+        <w:jc w:val="right"/>
+        <w:rPr/>
+      </w:pPr>
+      <w:r>
+        <w:rPr>
+          <w:rFonts w:ascii="Arial Unicode MS" w:cs="Arial Unicode MS" w:eastAsia="Arial Unicode MS" w:hAnsi="Arial Unicode MS"/>
+          <w:rtl w:val="0"/>
+        </w:rPr>
+        <w:t xml:space="preserve">ㅤㅤㅤ— Ninguém. — respondeu ela, sem pressa e sem medo de soar pequena. Não era um nome que a escondia. Era um nome que não dava para segurar.</w:t>
+      </w:r>
+    </w:p>
+    <w:p>
+      <w:pPr>
+        <w:keepNext w:val="0"/>
+        <w:keepLines w:val="0"/>
+        <w:pageBreakBefore w:val="0"/>
+        <w:widowControl w:val="0"/>
+        <w:pBdr>
+          <w:top w:space="0" w:sz="0" w:val="nil"/>
+          <w:left w:space="0" w:sz="0" w:val="nil"/>
+          <w:bottom w:space="0" w:sz="0" w:val="nil"/>
+          <w:right w:space="0" w:sz="0" w:val="nil"/>
+          <w:between w:space="0" w:sz="0" w:val="nil"/>
+        </w:pBdr>
+        <w:shd w:fill="auto" w:val="clear"/>
+        <w:spacing w:after="0" w:before="302.75421142578125" w:line="240" w:lineRule="auto"/>
+        <w:ind w:left="0" w:right="-1405.5118110236212" w:firstLine="0"/>
+        <w:jc w:val="right"/>
+        <w:rPr/>
+      </w:pPr>
+      <w:r>
+        <w:rPr>
+          <w:rFonts w:ascii="Arial Unicode MS" w:cs="Arial Unicode MS" w:eastAsia="Arial Unicode MS" w:hAnsi="Arial Unicode MS"/>
+          <w:rtl w:val="0"/>
+        </w:rPr>
+        <w:t xml:space="preserve">ㅤㅤㅤ</w:t>
+      </w:r>
+    </w:p>
+    <w:p>
+      <w:pPr>
+        <w:keepNext w:val="0"/>
+        <w:keepLines w:val="0"/>
+        <w:pageBreakBefore w:val="0"/>
+        <w:widowControl w:val="0"/>
+        <w:pBdr>
+          <w:top w:space="0" w:sz="0" w:val="nil"/>
+          <w:left w:space="0" w:sz="0" w:val="nil"/>
+          <w:bottom w:space="0" w:sz="0" w:val="nil"/>
+          <w:right w:space="0" w:sz="0" w:val="nil"/>
+          <w:between w:space="0" w:sz="0" w:val="nil"/>
+        </w:pBdr>
+        <w:shd w:fill="auto" w:val="clear"/>
+        <w:spacing w:after="0" w:before="302.75421142578125" w:line="240" w:lineRule="auto"/>
+        <w:ind w:left="0" w:right="-1405.5118110236212" w:firstLine="0"/>
+        <w:jc w:val="right"/>
+        <w:rPr/>
+      </w:pPr>
+      <w:r>
+        <w:rPr>
+          <w:rFonts w:ascii="Arial Unicode MS" w:cs="Arial Unicode MS" w:eastAsia="Arial Unicode MS" w:hAnsi="Arial Unicode MS"/>
+          <w:rtl w:val="0"/>
+        </w:rPr>
+        <w:t xml:space="preserve">ㅤㅤㅤ𝔄í começou o trabalho de verdade. Amália olhou as mãos dele, o jeito como se apoiava no braço do trono, os desenhos que caminhavam por baixo da pele, a hora exata em que a voz trocava de assunto — e reclassificou o que estava na frente dela. Não era algoz. Algoz desce do trono para medir o estrago que fez. Carcereiro fica sentado, conta os dias e vigia a porta; e carcereiro costuma gostar de conversa, porque conversa é a única companhia que a chave permite. — Você não guarda o véu — disse ela, firme, sem erguer a voz. — Você toma conta dele. Então me diga duas coisas: o que exatamente está atrás dessa porta, e quem é que está batendo do outro lado.</w:t>
+      </w:r>
+    </w:p>
+    <w:p>
+      <w:pPr>
+        <w:keepNext w:val="0"/>
+        <w:keepLines w:val="0"/>
+        <w:pageBreakBefore w:val="0"/>
+        <w:widowControl w:val="0"/>
+        <w:pBdr>
+          <w:top w:space="0" w:sz="0" w:val="nil"/>
+          <w:left w:space="0" w:sz="0" w:val="nil"/>
+          <w:bottom w:space="0" w:sz="0" w:val="nil"/>
+          <w:right w:space="0" w:sz="0" w:val="nil"/>
+          <w:between w:space="0" w:sz="0" w:val="nil"/>
+        </w:pBdr>
+        <w:shd w:fill="auto" w:val="clear"/>
+        <w:spacing w:after="0" w:before="302.75421142578125" w:line="240" w:lineRule="auto"/>
+        <w:ind w:left="0" w:right="-1405.5118110236212" w:firstLine="0"/>
+        <w:jc w:val="right"/>
+        <w:rPr/>
+      </w:pPr>
+      <w:r>
+        <w:rPr>
+          <w:rFonts w:ascii="Arial Unicode MS" w:cs="Arial Unicode MS" w:eastAsia="Arial Unicode MS" w:hAnsi="Arial Unicode MS"/>
+          <w:rtl w:val="0"/>
+        </w:rPr>
+        <w:t xml:space="preserve">ㅤㅤㅤ</w:t>
+      </w:r>
+    </w:p>
+    <w:p>
+      <w:pPr>
+        <w:keepNext w:val="0"/>
+        <w:keepLines w:val="0"/>
+        <w:pageBreakBefore w:val="0"/>
+        <w:widowControl w:val="0"/>
+        <w:pBdr>
+          <w:top w:space="0" w:sz="0" w:val="nil"/>
+          <w:left w:space="0" w:sz="0" w:val="nil"/>
+          <w:bottom w:space="0" w:sz="0" w:val="nil"/>
+          <w:right w:space="0" w:sz="0" w:val="nil"/>
+          <w:between w:space="0" w:sz="0" w:val="nil"/>
+        </w:pBdr>
+        <w:shd w:fill="auto" w:val="clear"/>
+        <w:spacing w:after="0" w:before="302.75421142578125" w:line="240" w:lineRule="auto"/>
+        <w:ind w:left="0" w:right="-1405.5118110236212" w:firstLine="0"/>
+        <w:jc w:val="right"/>
+        <w:rPr/>
+      </w:pPr>
+      <w:r>
+        <w:rPr>
+          <w:rtl w:val="0"/>
+        </w:rPr>
+        <w:t xml:space="preserve">─── ❖ ── ✦ ──</w:t>
+      </w:r>
+    </w:p>
+    <w:p>
+      <w:pPr>
+        <w:keepNext w:val="0"/>
+        <w:keepLines w:val="0"/>
+        <w:pageBreakBefore w:val="0"/>
+        <w:widowControl w:val="0"/>
+        <w:pBdr>
+          <w:top w:space="0" w:sz="0" w:val="nil"/>
+          <w:left w:space="0" w:sz="0" w:val="nil"/>
+          <w:bottom w:space="0" w:sz="0" w:val="nil"/>
+          <w:right w:space="0" w:sz="0" w:val="nil"/>
+          <w:between w:space="0" w:sz="0" w:val="nil"/>
+        </w:pBdr>
+        <w:shd w:fill="auto" w:val="clear"/>
+        <w:spacing w:after="0" w:before="302.75421142578125" w:line="240" w:lineRule="auto"/>
+        <w:ind w:left="0" w:right="-1405.5118110236212" w:firstLine="0"/>
+        <w:jc w:val="right"/>
+        <w:rPr/>
+      </w:pPr>
+      <w:r>
+        <w:rPr>
+          <w:rFonts w:ascii="Arial Unicode MS" w:cs="Arial Unicode MS" w:eastAsia="Arial Unicode MS" w:hAnsi="Arial Unicode MS"/>
+          <w:rtl w:val="0"/>
+        </w:rPr>
+        <w:t xml:space="preserve">ㅤㅤㅤ</w:t>
+      </w:r>
+    </w:p>
+    <w:p>
+      <w:pPr>
+        <w:keepNext w:val="0"/>
+        <w:keepLines w:val="0"/>
+        <w:pageBreakBefore w:val="0"/>
+        <w:widowControl w:val="0"/>
+        <w:pBdr>
+          <w:top w:space="0" w:sz="0" w:val="nil"/>
+          <w:left w:space="0" w:sz="0" w:val="nil"/>
+          <w:bottom w:space="0" w:sz="0" w:val="nil"/>
+          <w:right w:space="0" w:sz="0" w:val="nil"/>
+          <w:between w:space="0" w:sz="0" w:val="nil"/>
+        </w:pBdr>
+        <w:shd w:fill="auto" w:val="clear"/>
+        <w:spacing w:after="0" w:before="302.75421142578125" w:line="240" w:lineRule="auto"/>
+        <w:ind w:left="0" w:right="-1405.5118110236212" w:firstLine="0"/>
+        <w:jc w:val="right"/>
+        <w:rPr/>
+      </w:pPr>
+      <w:r>
+        <w:rPr>
+          <w:rFonts w:ascii="Arial Unicode MS" w:cs="Arial Unicode MS" w:eastAsia="Arial Unicode MS" w:hAnsi="Arial Unicode MS"/>
+          <w:rtl w:val="0"/>
+        </w:rPr>
+        <w:t xml:space="preserve">Resumo: Sem poderes e sem feridas dentro do mundo em preto e branco de Sorrow Peak, Amália reconhece que está num cárcere copiado de Dusk Falls, e não num santuário. Diante do Pérola Negra em seu trono, recusa o próprio nome — "Ninguém", porque nome é alça — e usa a leitura de corpo e de comportamento para reclassificá-lo de monstro para carcereiro. Em vez de atacar, cobra dele o que guarda e quem está batendo do outro lado do véu.</w:t>
       </w:r>
     </w:p>
     <w:sectPr>

</xml_diff>